<commit_message>
Remove real-name collection; nickname/username only
</commit_message>
<xml_diff>
--- a/Calm Chore PRD.docx
+++ b/Calm Chore PRD.docx
@@ -160,7 +160,7 @@
         <w:spacing w:after="140"/>
       </w:pPr>
       <w:r>
-        <w:t xml:space="preserve">The app's opening screen offers separate Parent and Child sign-in paths. A parent creates an account with their name and email, then can:</w:t>
+        <w:t xml:space="preserve">The app's opening screen offers separate Parent and Child sign-in paths. A parent creates an account with their name and email, must check a box confirming they've read and accept the Terms &amp; Conditions and Parental Consent Notice before the account can be created (a confirmation email with a copy of the notice follows automatically — see 4.13), then can:</w:t>
       </w:r>
     </w:p>
     <w:p>
@@ -186,7 +186,7 @@
         <w:spacing w:after="80"/>
       </w:pPr>
       <w:r>
-        <w:t xml:space="preserve">Add a profile for each child: name, a username that must be unique across the whole app, and a 6-digit passcode</w:t>
+        <w:t xml:space="preserve">Add a profile for each child: a parent-chosen username (unique across the whole app, used only to log in) and a 6-digit passcode — the app has no separate real-name field at all</w:t>
       </w:r>
     </w:p>
     <w:p>
@@ -194,7 +194,7 @@
         <w:spacing w:after="200"/>
       </w:pPr>
       <w:r>
-        <w:t xml:space="preserve">On first login, a child sets their own nickname (also unique app-wide, since it's used for friend search) and picks a personal accent colour from a curated set (blue, red, purple, orange, gold, teal — no two children on the same account can pick the same one). That colour follows the child everywhere: the chore calendar, header accents, and badges throughout their own login. Parents keep a fixed, calming green theme rather than choosing a colour. A parent can reset a child's passcode at any time from Setup.</w:t>
+        <w:t xml:space="preserve">On first login, a child sets their own nickname (also unique app-wide, since it's used for friend search) and picks a personal accent colour from a curated set (blue, red, purple, orange, gold, teal — no two children on the same account can pick the same one). The nickname becomes the only identifier shown anywhere in the app from that point on — calendar, chore lists, friends, everywhere — with the username used solely for login and never shown to other families. That colour follows the child everywhere: the chore calendar, header accents, and badges throughout their own login. Parents keep a fixed, calming green theme rather than choosing a colour. A parent can reset a child's passcode at any time from Setup.</w:t>
       </w:r>
     </w:p>
     <w:p>
@@ -311,6 +311,19 @@
       </w:pPr>
       <w:r>
         <w:t xml:space="preserve">A parent reviews each submission and marks it Complete, Partially Complete (entering an adjusted point award), or Incomplete (entering a reason the child can see), using three simple face-icon buttons (happy / neutral / sad) with the label always shown alongside, so the outcome reads at a glance</w:t>
+      </w:r>
+    </w:p>
+    <w:p>
+      <w:pPr>
+        <w:pStyle w:val="ListParagraph"/>
+        <w:numPr>
+          <w:ilvl w:val="0"/>
+          <w:numId w:val="2"/>
+        </w:numPr>
+        <w:spacing w:after="80"/>
+      </w:pPr>
+      <w:r>
+        <w:t xml:space="preserve">The moment that outcome is set, the proof photo is automatically and permanently deleted — it only ever exists to support that one review decision, never retained afterward (see 4.13)</w:t>
       </w:r>
     </w:p>
     <w:p>
@@ -496,7 +509,7 @@
         <w:spacing w:after="140"/>
       </w:pPr>
       <w:r>
-        <w:t xml:space="preserve">A child can search for another child by nickname only (not their real name, so a child can't be located by someone who isn't already an intended contact) and send a friend request. The request must be approved by the other child's own parent before the connection is made; the requesting child sees a Pending status in the meantime. Connected friends can see each other's name, nickname, streak, points, tier, and the names, dates, and points of their five most recent completed chores — never proof photos, which stay visible only within a child's own family. Either child can remove the friendship at any time, no approval needed on either side.</w:t>
+        <w:t xml:space="preserve">A child can search for another child by nickname only (not their real name, so a child can't be located by someone who isn't already an intended contact) and send a friend request. The request must be approved by the other child's own parent before the connection is made; the requesting child sees a Pending status in the meantime. Connected friends can see each other's nickname, streak, points, tier, and the names, dates, and points of their five most recent completed chores — never a real name (the app doesn't collect one) or proof photos, which stay visible only within a child's own family. Either child can remove the friendship at any time, no approval needed on either side.</w:t>
       </w:r>
     </w:p>
     <w:p>
@@ -629,46 +642,102 @@
         <w:spacing w:after="80"/>
       </w:pPr>
       <w:r>
-        <w:t xml:space="preserve">Every child profile is created by a parent, not self-registered by the child — this is the structural basis for parental consent, paired with an explicit privacy notice shown during parent account creation</w:t>
-      </w:r>
-    </w:p>
-    <w:p>
-      <w:pPr>
-        <w:pStyle w:val="ListParagraph"/>
-        <w:numPr>
-          <w:ilvl w:val="0"/>
-          <w:numId w:val="2"/>
-        </w:numPr>
-        <w:spacing w:after="80"/>
-      </w:pPr>
-      <w:r>
-        <w:t xml:space="preserve">What a connected friend (a different family) can see is limited to: name, nickname, streak, points, tier, and the last 5 completed chore names with date and points — nothing else</w:t>
-      </w:r>
-    </w:p>
-    <w:p>
-      <w:pPr>
-        <w:pStyle w:val="ListParagraph"/>
-        <w:numPr>
-          <w:ilvl w:val="0"/>
-          <w:numId w:val="2"/>
-        </w:numPr>
-        <w:spacing w:after="80"/>
-      </w:pPr>
-      <w:r>
-        <w:t xml:space="preserve">What is never shared outside a child's own family: proof photos, passcodes, email addresses, notification settings, and full chore or redemption history beyond that last-5 summary</w:t>
-      </w:r>
-    </w:p>
-    <w:p>
-      <w:pPr>
-        <w:pStyle w:val="ListParagraph"/>
-        <w:numPr>
-          <w:ilvl w:val="0"/>
-          <w:numId w:val="2"/>
-        </w:numPr>
-        <w:spacing w:after="80"/>
-      </w:pPr>
-      <w:r>
-        <w:t xml:space="preserve">A parent can request deletion of a child's profile and its data (photos, points history, chore history), which also removes that child from any friends' connections</w:t>
+        <w:t xml:space="preserve">Every child profile is created by a parent, not self-registered by the child — this is the structural basis for parental consent, paired with the explicit Terms &amp; Conditions and Parental Consent Notice covered in 4.13</w:t>
+      </w:r>
+    </w:p>
+    <w:p>
+      <w:pPr>
+        <w:pStyle w:val="ListParagraph"/>
+        <w:numPr>
+          <w:ilvl w:val="0"/>
+          <w:numId w:val="2"/>
+        </w:numPr>
+        <w:spacing w:after="80"/>
+      </w:pPr>
+      <w:r>
+        <w:t xml:space="preserve">A child's real/legal name is never collected at all — there's no such field anywhere in the app. A parent chooses a Username (login only, never shown to other families), and the child chooses a Nickname, which is the only identifier shown anywhere in the app, including to friends</w:t>
+      </w:r>
+    </w:p>
+    <w:p>
+      <w:pPr>
+        <w:pStyle w:val="ListParagraph"/>
+        <w:numPr>
+          <w:ilvl w:val="0"/>
+          <w:numId w:val="2"/>
+        </w:numPr>
+        <w:spacing w:after="80"/>
+      </w:pPr>
+      <w:r>
+        <w:t xml:space="preserve">Proof photos are deleted automatically the moment a parent sets a chore's outcome (Complete / Partially Complete / Incomplete) — they exist only to support that one review, never retained afterward or shown to friends</w:t>
+      </w:r>
+    </w:p>
+    <w:p>
+      <w:pPr>
+        <w:pStyle w:val="ListParagraph"/>
+        <w:numPr>
+          <w:ilvl w:val="0"/>
+          <w:numId w:val="2"/>
+        </w:numPr>
+        <w:spacing w:after="80"/>
+      </w:pPr>
+      <w:r>
+        <w:t xml:space="preserve">What a connected friend (a different family) can see is limited to: nickname, streak, points, tier, and the last 5 completed chore names with date and points — nothing else</w:t>
+      </w:r>
+    </w:p>
+    <w:p>
+      <w:pPr>
+        <w:pStyle w:val="ListParagraph"/>
+        <w:numPr>
+          <w:ilvl w:val="0"/>
+          <w:numId w:val="2"/>
+        </w:numPr>
+        <w:spacing w:after="80"/>
+      </w:pPr>
+      <w:r>
+        <w:t xml:space="preserve">What is never shared outside a child's own family: proof photos (already deleted per above), passcodes, email addresses, notification settings, and full chore or redemption history beyond that last-5 summary</w:t>
+      </w:r>
+    </w:p>
+    <w:p>
+      <w:pPr>
+        <w:pStyle w:val="ListParagraph"/>
+        <w:numPr>
+          <w:ilvl w:val="0"/>
+          <w:numId w:val="2"/>
+        </w:numPr>
+        <w:spacing w:after="80"/>
+      </w:pPr>
+      <w:r>
+        <w:t xml:space="preserve">A parent can request deletion of a child's profile and its data (points history, chore history), which also removes that child from any friends' connections</w:t>
+      </w:r>
+    </w:p>
+    <w:p>
+      <w:pPr>
+        <w:pStyle w:val="Heading2"/>
+        <w:spacing w:after="100" w:before="220"/>
+      </w:pPr>
+      <w:r>
+        <w:t xml:space="preserve">4.13 Terms &amp; Conditions and Parental Consent</w:t>
+      </w:r>
+    </w:p>
+    <w:p>
+      <w:pPr>
+        <w:spacing w:after="140"/>
+      </w:pPr>
+      <w:r>
+        <w:t xml:space="preserve">A full Terms &amp; Conditions and Parental Consent Notice has been drafted (“Calm Chore Terms and Conditions.docx”), written with COPPA's requirements in mind and covering: what's collected per actor, how it's used, the proof-photo deletion rule, the Friends disclosure, a parent's rights to review/correct/delete/refuse/revoke, retention limits, and security. It is shown to a parent during Create Account (4.1) and must be accepted — checkbox plus a follow-up confirmation email, which together serve as the app's verifiable-parental-consent mechanism — before the account can be created.</w:t>
+      </w:r>
+    </w:p>
+    <w:p>
+      <w:pPr>
+        <w:pStyle w:val="ListParagraph"/>
+        <w:numPr>
+          <w:ilvl w:val="0"/>
+          <w:numId w:val="2"/>
+        </w:numPr>
+        <w:spacing w:after="80"/>
+      </w:pPr>
+      <w:r>
+        <w:t xml:space="preserve">If the notice later changes in a way that changes what's collected, used, or shared, the parent must re-accept the current version before the account continues in use; minor wording clarifications don't require re-acceptance</w:t>
       </w:r>
     </w:p>
     <w:p>
@@ -683,7 +752,7 @@
         <w:t xml:space="preserve">Note: </w:t>
       </w:r>
       <w:r>
-        <w:t xml:space="preserve">since this can extend to children outside the immediate family, it likely falls under children's privacy regulations (e.g. COPPA in the US) once used beyond a single household. This spec sets the product-level baseline, but an actual privacy policy and legal review are still needed before any wider release.</w:t>
+        <w:t xml:space="preserve">this notice is a product-level draft, not a substitute for legal review. It should be finalized by a licensed attorney familiar with COPPA (and any other applicable children's privacy law) before real users see it.</w:t>
       </w:r>
     </w:p>
     <w:p>

</xml_diff>

<commit_message>
Add persistent Privacy Policy screen and inline photo-deletion reminder
</commit_message>
<xml_diff>
--- a/Calm Chore PRD.docx
+++ b/Calm Chore PRD.docx
@@ -323,7 +323,7 @@
         <w:spacing w:after="80"/>
       </w:pPr>
       <w:r>
-        <w:t xml:space="preserve">The moment that outcome is set, the proof photo is automatically and permanently deleted — it only ever exists to support that one review decision, never retained afterward (see 4.13)</w:t>
+        <w:t xml:space="preserve">The moment that outcome is set, the proof photo is automatically and permanently deleted — it only ever exists to support that one review decision, never retained afterward (see 4.13). A short reminder sits right next to the photo itself, not just buried in a settings page, so this is visible at the exact moment it matters</w:t>
       </w:r>
     </w:p>
     <w:p>
@@ -738,6 +738,19 @@
       </w:pPr>
       <w:r>
         <w:t xml:space="preserve">If the notice later changes in a way that changes what's collected, used, or shared, the parent must re-accept the current version before the account continues in use; minor wording clarifications don't require re-acceptance</w:t>
+      </w:r>
+    </w:p>
+    <w:p>
+      <w:pPr>
+        <w:pStyle w:val="ListParagraph"/>
+        <w:numPr>
+          <w:ilvl w:val="0"/>
+          <w:numId w:val="2"/>
+        </w:numPr>
+        <w:spacing w:after="80"/>
+      </w:pPr>
+      <w:r>
+        <w:t xml:space="preserve">The same notice stays permanently available afterward from Setup → Privacy Policy (not just a one-time signup screen), showing which version the parent accepted and when, and leading with a plain-language summary of the two things parents ask about most: automatic proof photo deletion and never collecting a child's real name — full text follows below that</w:t>
       </w:r>
     </w:p>
     <w:p>

</xml_diff>

<commit_message>
Simplify consent flow, redesign Chore Ideas, simplify passcode reset
</commit_message>
<xml_diff>
--- a/Calm Chore PRD.docx
+++ b/Calm Chore PRD.docx
@@ -160,20 +160,20 @@
         <w:spacing w:after="140"/>
       </w:pPr>
       <w:r>
-        <w:t xml:space="preserve">The app's opening screen offers separate Parent and Child sign-in paths. A parent creates an account with their name and email, must check a box confirming they've read and accept the Terms &amp; Conditions and Parental Consent Notice before the account can be created (a confirmation email with a copy of the notice follows automatically — see 4.13), then can:</w:t>
-      </w:r>
-    </w:p>
-    <w:p>
-      <w:pPr>
-        <w:pStyle w:val="ListParagraph"/>
-        <w:numPr>
-          <w:ilvl w:val="0"/>
-          <w:numId w:val="2"/>
-        </w:numPr>
-        <w:spacing w:after="80"/>
-      </w:pPr>
-      <w:r>
-        <w:t xml:space="preserve">Invite additional parents (name and email) who can also manage the same children</w:t>
+        <w:t xml:space="preserve">The app's opening screen offers separate Parent and Child sign-in paths. A parent creates an account with their name and email, must check a box confirming they've read and accept the Terms &amp; Conditions and Parental Consent Notice before the account can be created (see 4.13), then can:</w:t>
+      </w:r>
+    </w:p>
+    <w:p>
+      <w:pPr>
+        <w:pStyle w:val="ListParagraph"/>
+        <w:numPr>
+          <w:ilvl w:val="0"/>
+          <w:numId w:val="2"/>
+        </w:numPr>
+        <w:spacing w:after="80"/>
+      </w:pPr>
+      <w:r>
+        <w:t xml:space="preserve">Invite additional parents (name and email), who receive their own invite link to set a password and must individually accept the Terms &amp; Conditions and Parental Consent Notice on first login before gaining access — consent isn't inherited from whoever created the account</w:t>
       </w:r>
     </w:p>
     <w:p>
@@ -280,7 +280,7 @@
         <w:spacing w:after="80"/>
       </w:pPr>
       <w:r>
-        <w:t xml:space="preserve">A "Chore Ideas" library lets parents browse chore names and descriptions other families have created, as a source of best-practice inspiration — no child information or photos are shared. It ships pre-seeded with an age-banded starter list (2-3, 4-6, 7-11, 12+ years) so there's something to start from immediately, each with a suggested time estimate and points value using the same 1-point-per-10-minutes logic</w:t>
+        <w:t xml:space="preserve">A "Chore Ideas" library has two parts: a fixed "Example Chores" reference set, age-banded (2-3, 4-6, 7-11, 12+ years) with a suggested time estimate and points value using the same 1-point-per-10-minutes logic, so there's something to start from immediately; and "Chore Ideas from other families" — real chore names other parents have created, filtered to only those with at least one actual schedule (so test/abandoned entries don't clutter it), defaulting to a Most Popular view ranked by parent Likes with a toggle to see everything. No child information or photos are shared either way</w:t>
       </w:r>
     </w:p>
     <w:p>
@@ -403,7 +403,7 @@
         <w:spacing w:after="140"/>
       </w:pPr>
       <w:r>
-        <w:t xml:space="preserve">Two related safety nets protect a streak without requiring chores to be done every single day:</w:t>
+        <w:t xml:space="preserve">Two related safety nets protect a streak without requiring chores to be done every single day. "A day" and "a calendar week," here and for the Weekly Streak Bonus above, are always evaluated in the family's timezone of record (captured at parent Create Account, editable later if a family relocates) — not the server's timezone or whatever timezone a device happens to be in, so behavior stays consistent even if a child logs in while traveling.</w:t>
       </w:r>
     </w:p>
     <w:p>
@@ -509,7 +509,7 @@
         <w:spacing w:after="140"/>
       </w:pPr>
       <w:r>
-        <w:t xml:space="preserve">A child can search for another child by nickname only (not their real name, so a child can't be located by someone who isn't already an intended contact) and send a friend request. The request must be approved by the other child's own parent before the connection is made; the requesting child sees a Pending status in the meantime. Connected friends can see each other's nickname, streak, points, tier, and the names, dates, and points of their five most recent completed chores — never a real name (the app doesn't collect one) or proof photos, which stay visible only within a child's own family. Either child can remove the friendship at any time, no approval needed on either side.</w:t>
+        <w:t xml:space="preserve">A child can search for another child by nickname only — there's no real name in the system to search by in the first place, so a child can't be located by someone who isn't already an intended contact — and send a friend request. The request must be approved by the other child's own parent, who sees it alongside their Child Progress list with an Approve/Reject option, before the connection is made; the requesting child sees a Pending status in the meantime. Connected friends can see each other's nickname, streak, points, tier, and the names, dates, and points of their five most recent completed chores — never a real name (the app doesn't collect one) or proof photos, which stay visible only within a child's own family. Either child can remove the friendship at any time, no approval needed on either side.</w:t>
       </w:r>
     </w:p>
     <w:p>
@@ -724,7 +724,7 @@
         <w:spacing w:after="140"/>
       </w:pPr>
       <w:r>
-        <w:t xml:space="preserve">A full Terms &amp; Conditions and Parental Consent Notice has been drafted (“Calm Chore Terms and Conditions.docx”), written with COPPA's requirements in mind and covering: what's collected per actor, how it's used, the proof-photo deletion rule, the Friends disclosure, a parent's rights to review/correct/delete/refuse/revoke, retention limits, and security. It is shown to a parent during Create Account (4.1) and must be accepted — checkbox plus a follow-up confirmation email, which together serve as the app's verifiable-parental-consent mechanism — before the account can be created.</w:t>
+        <w:t xml:space="preserve">A full Terms &amp; Conditions and Parental Consent Notice has been drafted (“Calm Chore Terms and Conditions.docx”), written with COPPA's requirements in mind and covering: what's collected per actor, how it's used, the proof-photo deletion rule, the Friends disclosure, a parent's rights to review/correct/delete/refuse/revoke, retention limits, and security. It is shown to a parent during Create Account (4.1) and must be accepted via a single in-app checkbox tied to their account — modeled on the traditional signed-consent-form approach rather than a follow-up confirmation email — before the account can be created. The date/time of that first acceptance is recorded and never overwritten, even if a later version is re-accepted.</w:t>
       </w:r>
     </w:p>
     <w:p>
@@ -750,7 +750,7 @@
         <w:spacing w:after="80"/>
       </w:pPr>
       <w:r>
-        <w:t xml:space="preserve">The same notice stays permanently available afterward from Setup → Privacy Policy (not just a one-time signup screen), showing which version the parent accepted and when, and leading with a plain-language summary of the two things parents ask about most: automatic proof photo deletion and never collecting a child's real name — full text follows below that</w:t>
+        <w:t xml:space="preserve">The same notice stays permanently available afterward from Setup → Privacy Policy (not just a one-time signup screen), showing the earliest date/time the parent accepted it, and leading with a plain-language summary of the two things parents ask about most: automatic proof photo deletion and never collecting a child's real name — full text follows below that</w:t>
       </w:r>
     </w:p>
     <w:p>

</xml_diff>